<commit_message>
feat: menambahkan template surat
</commit_message>
<xml_diff>
--- a/storage/templates/surat-invoice.docx
+++ b/storage/templates/surat-invoice.docx
@@ -482,8 +482,8 @@
         <w:gridCol w:w="704"/>
         <w:gridCol w:w="3402"/>
         <w:gridCol w:w="851"/>
-        <w:gridCol w:w="1842"/>
-        <w:gridCol w:w="2694"/>
+        <w:gridCol w:w="2126"/>
+        <w:gridCol w:w="2410"/>
       </w:tblGrid>
       <w:tr>
         <w:trPr>
@@ -573,7 +573,7 @@
         </w:tc>
         <w:tc>
           <w:tcPr>
-            <w:tcW w:w="1842" w:type="dxa"/>
+            <w:tcW w:w="2126" w:type="dxa"/>
             <w:tcBorders>
               <w:top w:val="single" w:sz="8" w:space="0" w:color="auto"/>
             </w:tcBorders>
@@ -600,7 +600,7 @@
         </w:tc>
         <w:tc>
           <w:tcPr>
-            <w:tcW w:w="2694" w:type="dxa"/>
+            <w:tcW w:w="2410" w:type="dxa"/>
             <w:tcBorders>
               <w:top w:val="single" w:sz="8" w:space="0" w:color="auto"/>
             </w:tcBorders>
@@ -672,7 +672,7 @@
             <w:pPr>
               <w:pStyle w:val="BodyText"/>
               <w:ind w:right="51"/>
-              <w:jc w:val="both"/>
+              <w:jc w:val="center"/>
             </w:pPr>
             <w:r>
               <w:t>${item_qty}</w:t>
@@ -681,7 +681,7 @@
         </w:tc>
         <w:tc>
           <w:tcPr>
-            <w:tcW w:w="1842" w:type="dxa"/>
+            <w:tcW w:w="2126" w:type="dxa"/>
           </w:tcPr>
           <w:p>
             <w:pPr>
@@ -696,7 +696,7 @@
         </w:tc>
         <w:tc>
           <w:tcPr>
-            <w:tcW w:w="2694" w:type="dxa"/>
+            <w:tcW w:w="2410" w:type="dxa"/>
           </w:tcPr>
           <w:p>
             <w:pPr>
@@ -724,11 +724,29 @@
               <w:ind w:right="51"/>
               <w:jc w:val="center"/>
             </w:pPr>
+            <w:r>
+              <w:rPr>
+                <w:i/>
+              </w:rPr>
+              <w:t>“</w:t>
+            </w:r>
+            <w:r>
+              <w:rPr>
+                <w:i/>
+              </w:rPr>
+              <w:t>${terbilang}</w:t>
+            </w:r>
+            <w:r>
+              <w:rPr>
+                <w:i/>
+              </w:rPr>
+              <w:t>”</w:t>
+            </w:r>
           </w:p>
         </w:tc>
         <w:tc>
           <w:tcPr>
-            <w:tcW w:w="1842" w:type="dxa"/>
+            <w:tcW w:w="2126" w:type="dxa"/>
           </w:tcPr>
           <w:p>
             <w:pPr>
@@ -751,7 +769,7 @@
         </w:tc>
         <w:tc>
           <w:tcPr>
-            <w:tcW w:w="2694" w:type="dxa"/>
+            <w:tcW w:w="2410" w:type="dxa"/>
             <w:vAlign w:val="center"/>
           </w:tcPr>
           <w:p>
@@ -783,7 +801,7 @@
         </w:tc>
         <w:tc>
           <w:tcPr>
-            <w:tcW w:w="1842" w:type="dxa"/>
+            <w:tcW w:w="2126" w:type="dxa"/>
           </w:tcPr>
           <w:p>
             <w:pPr>
@@ -806,7 +824,7 @@
         </w:tc>
         <w:tc>
           <w:tcPr>
-            <w:tcW w:w="2694" w:type="dxa"/>
+            <w:tcW w:w="2410" w:type="dxa"/>
           </w:tcPr>
           <w:p>
             <w:pPr>
@@ -837,7 +855,7 @@
         </w:tc>
         <w:tc>
           <w:tcPr>
-            <w:tcW w:w="1842" w:type="dxa"/>
+            <w:tcW w:w="2126" w:type="dxa"/>
           </w:tcPr>
           <w:p>
             <w:pPr>
@@ -860,7 +878,7 @@
         </w:tc>
         <w:tc>
           <w:tcPr>
-            <w:tcW w:w="2694" w:type="dxa"/>
+            <w:tcW w:w="2410" w:type="dxa"/>
           </w:tcPr>
           <w:p>
             <w:pPr>
@@ -891,7 +909,7 @@
         </w:tc>
         <w:tc>
           <w:tcPr>
-            <w:tcW w:w="1842" w:type="dxa"/>
+            <w:tcW w:w="2126" w:type="dxa"/>
           </w:tcPr>
           <w:p>
             <w:pPr>
@@ -914,7 +932,7 @@
         </w:tc>
         <w:tc>
           <w:tcPr>
-            <w:tcW w:w="2694" w:type="dxa"/>
+            <w:tcW w:w="2410" w:type="dxa"/>
             <w:vAlign w:val="center"/>
           </w:tcPr>
           <w:p>

</xml_diff>